<commit_message>
modification 048 liaison créma - ajout prénom
</commit_message>
<xml_diff>
--- a/docs/modeles_civicrm_vierges/048-OPP_FUN-Liaison_Crematorium.docx
+++ b/docs/modeles_civicrm_vierges/048-OPP_FUN-Liaison_Crematorium.docx
@@ -1084,7 +1084,7 @@
         </w:rPr>
       </w:pPr>
       <w:r>
-        <w:pict w14:anchorId="76EAB6B5">
+        <w:pict w14:anchorId="5ACC1246">
           <v:rect id="Horizontal Line 1" o:spid="_x0000_s1027" alt="" style="width:7.4pt;height:.05pt;visibility:visible;mso-wrap-style:square;mso-width-percent:0;mso-height-percent:0;mso-left-percent:-10001;mso-top-percent:-10001;mso-position-horizontal:absolute;mso-position-horizontal-relative:char;mso-position-vertical:absolute;mso-position-vertical-relative:line;mso-width-percent:0;mso-height-percent:0;mso-left-percent:-10001;mso-top-percent:-10001;v-text-anchor:top" stroked="f">
             <o:lock v:ext="edit" rotation="t" aspectratio="t" verticies="t" text="t" shapetype="t"/>
             <w10:anchorlock/>
@@ -1182,7 +1182,47 @@
                 <w:szCs w:val="15"/>
                 <w:lang w:eastAsia="fr-FR"/>
               </w:rPr>
-              <w:t>{Tokens_PAQPF_Champs_de_fusion_1.Contact_RelationshipCache_Contact_01.postal_greeting_display} {Tokens_PAQPF_Champs_de_fusion_1.CONCAT_WS_Contact_RelationshipCache_Contact_01_last_name_Contact_RelationshipCache_Contact_01_nick_name}</w:t>
+              <w:t xml:space="preserve">{Tokens_PAQPF_Champs_de_fusion_1.Contact_RelationshipCache_Contact_01.postal_greeting_display} </w:t>
+            </w:r>
+            <w:r>
+              <w:rPr>
+                <w:rFonts w:ascii="Arial" w:eastAsia="Times New Roman" w:hAnsi="Arial" w:cs="Arial"/>
+                <w:color w:val="00B4AE"/>
+                <w:sz w:val="15"/>
+                <w:szCs w:val="15"/>
+                <w:lang w:eastAsia="fr-FR"/>
+              </w:rPr>
+              <w:t xml:space="preserve">{Tokens_PAQPF_Champs_de_fusion_1.Contact_RelationshipCache_Contact_01.first_name} </w:t>
+            </w:r>
+            <w:r>
+              <w:rPr>
+                <w:rFonts w:ascii="Arial" w:eastAsia="Times New Roman" w:hAnsi="Arial" w:cs="Arial"/>
+                <w:color w:val="00B4AE"/>
+                <w:sz w:val="15"/>
+                <w:szCs w:val="15"/>
+                <w:lang w:eastAsia="fr-FR"/>
+              </w:rPr>
+              <w:t>{Tokens_PAQPF_Champs_de_fusion_1.CONCAT_WS_Contact_RelationshipCache_Contact_01_last_name_Contact_RelationshipCache_Co</w:t>
+            </w:r>
+            <w:r>
+              <w:rPr>
+                <w:rFonts w:ascii="Arial" w:eastAsia="Times New Roman" w:hAnsi="Arial" w:cs="Arial"/>
+                <w:color w:val="00B4AE"/>
+                <w:sz w:val="15"/>
+                <w:szCs w:val="15"/>
+                <w:lang w:eastAsia="fr-FR"/>
+              </w:rPr>
+              <w:t>n</w:t>
+            </w:r>
+            <w:r>
+              <w:rPr>
+                <w:rFonts w:ascii="Arial" w:eastAsia="Times New Roman" w:hAnsi="Arial" w:cs="Arial"/>
+                <w:color w:val="00B4AE"/>
+                <w:sz w:val="15"/>
+                <w:szCs w:val="15"/>
+                <w:lang w:eastAsia="fr-FR"/>
+              </w:rPr>
+              <w:t>tact_01_nick_name}</w:t>
             </w:r>
           </w:p>
           <w:p>
@@ -1410,7 +1450,7 @@
         </w:rPr>
       </w:pPr>
       <w:r>
-        <w:pict w14:anchorId="47B7BAD8">
+        <w:pict w14:anchorId="3AB18E17">
           <v:rect id="Horizontal Line 2" o:spid="_x0000_s1026" alt="" style="width:7.4pt;height:.05pt;visibility:visible;mso-wrap-style:square;mso-width-percent:0;mso-height-percent:0;mso-left-percent:-10001;mso-top-percent:-10001;mso-position-horizontal:absolute;mso-position-horizontal-relative:char;mso-position-vertical:absolute;mso-position-vertical-relative:line;mso-width-percent:0;mso-height-percent:0;mso-left-percent:-10001;mso-top-percent:-10001;v-text-anchor:top" stroked="f">
             <o:lock v:ext="edit" rotation="t" aspectratio="t" verticies="t" text="t" shapetype="t"/>
             <w10:anchorlock/>
@@ -1840,10 +1880,10 @@
                 <w:szCs w:val="20"/>
               </w:rPr>
               <w:drawing>
-                <wp:inline distT="0" distB="0" distL="0" distR="0" wp14:anchorId="761075D0" wp14:editId="7084A0A0">
-                  <wp:extent cx="1855986" cy="816634"/>
-                  <wp:effectExtent l="0" t="0" r="0" b="0"/>
-                  <wp:docPr id="1009184800" name="Image 1"/>
+                <wp:inline distT="0" distB="0" distL="0" distR="0" wp14:anchorId="51766C84" wp14:editId="472DEF07">
+                  <wp:extent cx="1590675" cy="478288"/>
+                  <wp:effectExtent l="0" t="0" r="0" b="4445"/>
+                  <wp:docPr id="2074606862" name="Image 1" descr="Une image contenant noir, obscurité&#10;&#10;Description générée automatiquement"/>
                   <wp:cNvGraphicFramePr>
                     <a:graphicFrameLocks xmlns:a="http://schemas.openxmlformats.org/drawingml/2006/main" noChangeAspect="1"/>
                   </wp:cNvGraphicFramePr>
@@ -1851,29 +1891,36 @@
                     <a:graphicData uri="http://schemas.openxmlformats.org/drawingml/2006/picture">
                       <pic:pic xmlns:pic="http://schemas.openxmlformats.org/drawingml/2006/picture">
                         <pic:nvPicPr>
-                          <pic:cNvPr id="1009184800" name="Image 1009184800"/>
-                          <pic:cNvPicPr/>
+                          <pic:cNvPr id="2074606862" name="Image 1" descr="Une image contenant noir, obscurité&#10;&#10;Description générée automatiquement"/>
+                          <pic:cNvPicPr>
+                            <a:picLocks noChangeAspect="1" noChangeArrowheads="1"/>
+                          </pic:cNvPicPr>
                         </pic:nvPicPr>
                         <pic:blipFill>
-                          <a:blip r:embed="rId8">
+                          <a:blip r:embed="rId8" cstate="print">
                             <a:extLst>
                               <a:ext uri="{28A0092B-C50C-407E-A947-70E740481C1C}">
                                 <a14:useLocalDpi xmlns:a14="http://schemas.microsoft.com/office/drawing/2010/main" val="0"/>
                               </a:ext>
                             </a:extLst>
                           </a:blip>
+                          <a:srcRect/>
                           <a:stretch>
                             <a:fillRect/>
                           </a:stretch>
                         </pic:blipFill>
-                        <pic:spPr>
+                        <pic:spPr bwMode="auto">
                           <a:xfrm>
                             <a:off x="0" y="0"/>
-                            <a:ext cx="1966926" cy="865448"/>
+                            <a:ext cx="1648386" cy="495641"/>
                           </a:xfrm>
                           <a:prstGeom prst="rect">
                             <a:avLst/>
                           </a:prstGeom>
+                          <a:noFill/>
+                          <a:ln>
+                            <a:noFill/>
+                          </a:ln>
                         </pic:spPr>
                       </pic:pic>
                     </a:graphicData>
@@ -2083,6 +2130,165 @@
 
 <file path=word/footer2.xml><?xml version="1.0" encoding="utf-8"?>
 <w:ftr xmlns:wpc="http://schemas.microsoft.com/office/word/2010/wordprocessingCanvas" xmlns:cx="http://schemas.microsoft.com/office/drawing/2014/chartex" xmlns:cx1="http://schemas.microsoft.com/office/drawing/2015/9/8/chartex" xmlns:cx2="http://schemas.microsoft.com/office/drawing/2015/10/21/chartex" xmlns:cx3="http://schemas.microsoft.com/office/drawing/2016/5/9/chartex" xmlns:cx4="http://schemas.microsoft.com/office/drawing/2016/5/10/chartex" xmlns:cx5="http://schemas.microsoft.com/office/drawing/2016/5/11/chartex" xmlns:cx6="http://schemas.microsoft.com/office/drawing/2016/5/12/chartex" xmlns:cx7="http://schemas.microsoft.com/office/drawing/2016/5/13/chartex" xmlns:cx8="http://schemas.microsoft.com/office/drawing/2016/5/14/chartex" xmlns:mc="http://schemas.openxmlformats.org/markup-compatibility/2006" xmlns:aink="http://schemas.microsoft.com/office/drawing/2016/ink" xmlns:am3d="http://schemas.microsoft.com/office/drawing/2017/model3d" xmlns:o="urn:schemas-microsoft-com:office:office" xmlns:oel="http://schemas.microsoft.com/office/2019/extlst" xmlns:r="http://schemas.openxmlformats.org/officeDocument/2006/relationships" xmlns:m="http://schemas.openxmlformats.org/officeDocument/2006/math" xmlns:v="urn:schemas-microsoft-com:vml" xmlns:wp14="http://schemas.microsoft.com/office/word/2010/wordprocessingDrawing" xmlns:wp="http://schemas.openxmlformats.org/drawingml/2006/wordprocessingDrawing" xmlns:w10="urn:schemas-microsoft-com:office:word" xmlns:w="http://schemas.openxmlformats.org/wordprocessingml/2006/main" xmlns:w14="http://schemas.microsoft.com/office/word/2010/wordml" xmlns:w15="http://schemas.microsoft.com/office/word/2012/wordml" xmlns:w16cex="http://schemas.microsoft.com/office/word/2018/wordml/cex" xmlns:w16cid="http://schemas.microsoft.com/office/word/2016/wordml/cid" xmlns:w16="http://schemas.microsoft.com/office/word/2018/wordml" xmlns:w16du="http://schemas.microsoft.com/office/word/2023/wordml/word16du" xmlns:w16sdtdh="http://schemas.microsoft.com/office/word/2020/wordml/sdtdatahash" xmlns:w16sdtfl="http://schemas.microsoft.com/office/word/2024/wordml/sdtformatlock" xmlns:w16se="http://schemas.microsoft.com/office/word/2015/wordml/symex" xmlns:wpg="http://schemas.microsoft.com/office/word/2010/wordprocessingGroup" xmlns:wpi="http://schemas.microsoft.com/office/word/2010/wordprocessingInk" xmlns:wne="http://schemas.microsoft.com/office/word/2006/wordml" xmlns:wps="http://schemas.microsoft.com/office/word/2010/wordprocessingShape" mc:Ignorable="w14 w15 w16se w16cid w16 w16cex w16sdtdh w16sdtfl w16du wp14">
+  <w:tbl>
+    <w:tblPr>
+      <w:tblW w:w="4900" w:type="pct"/>
+      <w:tblInd w:w="198" w:type="dxa"/>
+      <w:tblLayout w:type="fixed"/>
+      <w:tblCellMar>
+        <w:left w:w="5" w:type="dxa"/>
+        <w:right w:w="5" w:type="dxa"/>
+      </w:tblCellMar>
+      <w:tblLook w:val="04A0" w:firstRow="1" w:lastRow="0" w:firstColumn="1" w:lastColumn="0" w:noHBand="0" w:noVBand="1"/>
+    </w:tblPr>
+    <w:tblGrid>
+      <w:gridCol w:w="3441"/>
+      <w:gridCol w:w="1547"/>
+      <w:gridCol w:w="3359"/>
+      <w:gridCol w:w="1978"/>
+    </w:tblGrid>
+    <w:tr>
+      <w:trPr>
+        <w:cantSplit/>
+        <w:trHeight w:val="624"/>
+      </w:trPr>
+      <w:tc>
+        <w:tcPr>
+          <w:tcW w:w="3444" w:type="dxa"/>
+          <w:tcBorders>
+            <w:top w:val="single" w:sz="4" w:space="0" w:color="FFFFFF"/>
+            <w:left w:val="single" w:sz="4" w:space="0" w:color="FFFFFF"/>
+            <w:bottom w:val="single" w:sz="4" w:space="0" w:color="FFFFFF"/>
+            <w:right w:val="single" w:sz="4" w:space="0" w:color="FFFFFF"/>
+          </w:tcBorders>
+        </w:tcPr>
+        <w:p>
+          <w:pPr>
+            <w:pStyle w:val="ADRESSEpieddepage"/>
+          </w:pPr>
+          <w:r>
+            <w:t>Faculté de médecine</w:t>
+          </w:r>
+          <w:r>
+            <w:br/>
+            <w:t xml:space="preserve">10 bd Tonnellé </w:t>
+          </w:r>
+          <w:r>
+            <w:br/>
+            <w:t>BP 3223</w:t>
+          </w:r>
+          <w:r>
+            <w:br/>
+            <w:t>37032 Tours cedex 1</w:t>
+          </w:r>
+        </w:p>
+      </w:tc>
+      <w:tc>
+        <w:tcPr>
+          <w:tcW w:w="1548" w:type="dxa"/>
+          <w:tcBorders>
+            <w:top w:val="single" w:sz="4" w:space="0" w:color="FFFFFF"/>
+            <w:left w:val="single" w:sz="4" w:space="0" w:color="FFFFFF"/>
+            <w:bottom w:val="single" w:sz="4" w:space="0" w:color="FFFFFF"/>
+            <w:right w:val="single" w:sz="4" w:space="0" w:color="FFFFFF"/>
+          </w:tcBorders>
+        </w:tcPr>
+        <w:p>
+          <w:pPr>
+            <w:pStyle w:val="ADRESSEpieddepage"/>
+          </w:pPr>
+          <w:r>
+            <w:t>02 34 37 96 43</w:t>
+          </w:r>
+        </w:p>
+        <w:p>
+          <w:pPr>
+            <w:pStyle w:val="ADRESSEpieddepage"/>
+          </w:pPr>
+          <w:r>
+            <w:t>02 47 36 61 36</w:t>
+          </w:r>
+        </w:p>
+        <w:p>
+          <w:pPr>
+            <w:pStyle w:val="ADRESSEpieddepage"/>
+          </w:pPr>
+          <w:r>
+            <w:t>02 47 36 60 40</w:t>
+          </w:r>
+        </w:p>
+      </w:tc>
+      <w:tc>
+        <w:tcPr>
+          <w:tcW w:w="3362" w:type="dxa"/>
+          <w:tcBorders>
+            <w:top w:val="single" w:sz="4" w:space="0" w:color="FFFFFF"/>
+            <w:left w:val="single" w:sz="4" w:space="0" w:color="FFFFFF"/>
+            <w:bottom w:val="single" w:sz="4" w:space="0" w:color="FFFFFF"/>
+            <w:right w:val="single" w:sz="4" w:space="0" w:color="FFFFFF"/>
+          </w:tcBorders>
+        </w:tcPr>
+        <w:p>
+          <w:pPr>
+            <w:pStyle w:val="ADRESSEpieddepage"/>
+          </w:pPr>
+          <w:hyperlink r:id="rId1">
+            <w:r>
+              <w:rPr>
+                <w:rStyle w:val="Lienhypertexte"/>
+              </w:rPr>
+              <w:t>stephane.velut@univ-tours.fr</w:t>
+            </w:r>
+          </w:hyperlink>
+        </w:p>
+        <w:p>
+          <w:pPr>
+            <w:pStyle w:val="ADRESSEpieddepage"/>
+          </w:pPr>
+          <w:hyperlink r:id="rId2">
+            <w:r>
+              <w:rPr>
+                <w:rStyle w:val="Lienhypertexte"/>
+              </w:rPr>
+              <w:t>christophe.destrieux@univ-tours.fr</w:t>
+            </w:r>
+          </w:hyperlink>
+        </w:p>
+        <w:p>
+          <w:pPr>
+            <w:pStyle w:val="ADRESSEpieddepage"/>
+          </w:pPr>
+          <w:hyperlink r:id="rId3">
+            <w:r>
+              <w:rPr>
+                <w:rStyle w:val="Lienhypertexte"/>
+              </w:rPr>
+              <w:t>carine.beausse@univ-tours.fr</w:t>
+            </w:r>
+          </w:hyperlink>
+        </w:p>
+      </w:tc>
+      <w:tc>
+        <w:tcPr>
+          <w:tcW w:w="1980" w:type="dxa"/>
+          <w:tcBorders>
+            <w:top w:val="single" w:sz="4" w:space="0" w:color="FFFFFF"/>
+            <w:left w:val="single" w:sz="4" w:space="0" w:color="FFFFFF"/>
+            <w:bottom w:val="single" w:sz="4" w:space="0" w:color="FFFFFF"/>
+            <w:right w:val="single" w:sz="4" w:space="0" w:color="FFFFFF"/>
+          </w:tcBorders>
+        </w:tcPr>
+        <w:p>
+          <w:pPr>
+            <w:pStyle w:val="ADRESSEpieddepage"/>
+          </w:pPr>
+          <w:r>
+            <w:t>med.univ-tours.fr</w:t>
+          </w:r>
+        </w:p>
+      </w:tc>
+    </w:tr>
+  </w:tbl>
   <w:p>
     <w:pPr>
       <w:pStyle w:val="ADRESSEpieddepage"/>
@@ -2093,6 +2299,198 @@
 
 <file path=word/footer3.xml><?xml version="1.0" encoding="utf-8"?>
 <w:ftr xmlns:wpc="http://schemas.microsoft.com/office/word/2010/wordprocessingCanvas" xmlns:cx="http://schemas.microsoft.com/office/drawing/2014/chartex" xmlns:cx1="http://schemas.microsoft.com/office/drawing/2015/9/8/chartex" xmlns:cx2="http://schemas.microsoft.com/office/drawing/2015/10/21/chartex" xmlns:cx3="http://schemas.microsoft.com/office/drawing/2016/5/9/chartex" xmlns:cx4="http://schemas.microsoft.com/office/drawing/2016/5/10/chartex" xmlns:cx5="http://schemas.microsoft.com/office/drawing/2016/5/11/chartex" xmlns:cx6="http://schemas.microsoft.com/office/drawing/2016/5/12/chartex" xmlns:cx7="http://schemas.microsoft.com/office/drawing/2016/5/13/chartex" xmlns:cx8="http://schemas.microsoft.com/office/drawing/2016/5/14/chartex" xmlns:mc="http://schemas.openxmlformats.org/markup-compatibility/2006" xmlns:aink="http://schemas.microsoft.com/office/drawing/2016/ink" xmlns:am3d="http://schemas.microsoft.com/office/drawing/2017/model3d" xmlns:o="urn:schemas-microsoft-com:office:office" xmlns:oel="http://schemas.microsoft.com/office/2019/extlst" xmlns:r="http://schemas.openxmlformats.org/officeDocument/2006/relationships" xmlns:m="http://schemas.openxmlformats.org/officeDocument/2006/math" xmlns:v="urn:schemas-microsoft-com:vml" xmlns:wp14="http://schemas.microsoft.com/office/word/2010/wordprocessingDrawing" xmlns:wp="http://schemas.openxmlformats.org/drawingml/2006/wordprocessingDrawing" xmlns:w10="urn:schemas-microsoft-com:office:word" xmlns:w="http://schemas.openxmlformats.org/wordprocessingml/2006/main" xmlns:w14="http://schemas.microsoft.com/office/word/2010/wordml" xmlns:w15="http://schemas.microsoft.com/office/word/2012/wordml" xmlns:w16cex="http://schemas.microsoft.com/office/word/2018/wordml/cex" xmlns:w16cid="http://schemas.microsoft.com/office/word/2016/wordml/cid" xmlns:w16="http://schemas.microsoft.com/office/word/2018/wordml" xmlns:w16du="http://schemas.microsoft.com/office/word/2023/wordml/word16du" xmlns:w16sdtdh="http://schemas.microsoft.com/office/word/2020/wordml/sdtdatahash" xmlns:w16sdtfl="http://schemas.microsoft.com/office/word/2024/wordml/sdtformatlock" xmlns:w16se="http://schemas.microsoft.com/office/word/2015/wordml/symex" xmlns:wpg="http://schemas.microsoft.com/office/word/2010/wordprocessingGroup" xmlns:wpi="http://schemas.microsoft.com/office/word/2010/wordprocessingInk" xmlns:wne="http://schemas.microsoft.com/office/word/2006/wordml" xmlns:wps="http://schemas.microsoft.com/office/word/2010/wordprocessingShape" mc:Ignorable="w14 w15 w16se w16cid w16 w16cex w16sdtdh w16sdtfl w16du wp14">
+  <w:tbl>
+    <w:tblPr>
+      <w:tblW w:w="4900" w:type="pct"/>
+      <w:tblInd w:w="198" w:type="dxa"/>
+      <w:tblLayout w:type="fixed"/>
+      <w:tblCellMar>
+        <w:left w:w="5" w:type="dxa"/>
+        <w:right w:w="5" w:type="dxa"/>
+      </w:tblCellMar>
+      <w:tblLook w:val="04A0" w:firstRow="1" w:lastRow="0" w:firstColumn="1" w:lastColumn="0" w:noHBand="0" w:noVBand="1"/>
+    </w:tblPr>
+    <w:tblGrid>
+      <w:gridCol w:w="3468"/>
+      <w:gridCol w:w="1524"/>
+      <w:gridCol w:w="3359"/>
+      <w:gridCol w:w="1974"/>
+    </w:tblGrid>
+    <w:tr>
+      <w:trPr>
+        <w:cantSplit/>
+        <w:trHeight w:val="624"/>
+      </w:trPr>
+      <w:tc>
+        <w:tcPr>
+          <w:tcW w:w="3471" w:type="dxa"/>
+          <w:tcBorders>
+            <w:top w:val="single" w:sz="4" w:space="0" w:color="FFFFFF"/>
+            <w:left w:val="single" w:sz="4" w:space="0" w:color="FFFFFF"/>
+            <w:bottom w:val="single" w:sz="4" w:space="0" w:color="FFFFFF"/>
+            <w:right w:val="single" w:sz="4" w:space="0" w:color="FFFFFF"/>
+          </w:tcBorders>
+        </w:tcPr>
+        <w:p>
+          <w:pPr>
+            <w:pStyle w:val="ADRESSEpieddepage"/>
+            <w:rPr>
+              <w:rFonts w:ascii="Arial" w:hAnsi="Arial" w:cs="Arial"/>
+            </w:rPr>
+          </w:pPr>
+          <w:r>
+            <w:rPr>
+              <w:rFonts w:ascii="Arial" w:hAnsi="Arial" w:cs="Arial"/>
+            </w:rPr>
+            <w:t>Faculté de médecine</w:t>
+          </w:r>
+          <w:r>
+            <w:rPr>
+              <w:rFonts w:ascii="Arial" w:hAnsi="Arial" w:cs="Arial"/>
+            </w:rPr>
+            <w:br/>
+            <w:t xml:space="preserve">10 bd Tonnellé </w:t>
+          </w:r>
+          <w:r>
+            <w:rPr>
+              <w:rFonts w:ascii="Arial" w:hAnsi="Arial" w:cs="Arial"/>
+            </w:rPr>
+            <w:br/>
+            <w:t>BP 3223</w:t>
+          </w:r>
+          <w:r>
+            <w:rPr>
+              <w:rFonts w:ascii="Arial" w:hAnsi="Arial" w:cs="Arial"/>
+            </w:rPr>
+            <w:br/>
+            <w:t>37032 Tours cedex 1</w:t>
+          </w:r>
+        </w:p>
+      </w:tc>
+      <w:tc>
+        <w:tcPr>
+          <w:tcW w:w="1525" w:type="dxa"/>
+          <w:tcBorders>
+            <w:top w:val="single" w:sz="4" w:space="0" w:color="FFFFFF"/>
+            <w:left w:val="single" w:sz="4" w:space="0" w:color="FFFFFF"/>
+            <w:bottom w:val="single" w:sz="4" w:space="0" w:color="FFFFFF"/>
+            <w:right w:val="single" w:sz="4" w:space="0" w:color="FFFFFF"/>
+          </w:tcBorders>
+        </w:tcPr>
+        <w:p>
+          <w:pPr>
+            <w:pStyle w:val="ADRESSEpieddepage"/>
+            <w:rPr>
+              <w:rFonts w:ascii="Arial" w:hAnsi="Arial" w:cs="Arial"/>
+            </w:rPr>
+          </w:pPr>
+          <w:r>
+            <w:rPr>
+              <w:rFonts w:ascii="Arial" w:hAnsi="Arial" w:cs="Arial"/>
+            </w:rPr>
+            <w:t>02 47 36 61 36</w:t>
+          </w:r>
+        </w:p>
+        <w:p>
+          <w:pPr>
+            <w:pStyle w:val="ADRESSEpieddepage"/>
+            <w:rPr>
+              <w:rFonts w:ascii="Arial" w:hAnsi="Arial" w:cs="Arial"/>
+            </w:rPr>
+          </w:pPr>
+          <w:r>
+            <w:rPr>
+              <w:rFonts w:ascii="Arial" w:hAnsi="Arial" w:cs="Arial"/>
+            </w:rPr>
+            <w:t>02 47 36 60 40</w:t>
+          </w:r>
+        </w:p>
+      </w:tc>
+      <w:tc>
+        <w:tcPr>
+          <w:tcW w:w="3362" w:type="dxa"/>
+          <w:tcBorders>
+            <w:top w:val="single" w:sz="4" w:space="0" w:color="FFFFFF"/>
+            <w:left w:val="single" w:sz="4" w:space="0" w:color="FFFFFF"/>
+            <w:bottom w:val="single" w:sz="4" w:space="0" w:color="FFFFFF"/>
+            <w:right w:val="single" w:sz="4" w:space="0" w:color="FFFFFF"/>
+          </w:tcBorders>
+        </w:tcPr>
+        <w:p>
+          <w:pPr>
+            <w:pStyle w:val="ADRESSEpieddepage"/>
+            <w:rPr>
+              <w:rFonts w:ascii="Arial" w:hAnsi="Arial" w:cs="Arial"/>
+              <w:color w:val="0563C1"/>
+              <w:u w:val="single"/>
+            </w:rPr>
+          </w:pPr>
+          <w:hyperlink r:id="rId1">
+            <w:r>
+              <w:rPr>
+                <w:rStyle w:val="Lienhypertexte"/>
+                <w:rFonts w:ascii="Arial" w:hAnsi="Arial" w:cs="Arial"/>
+              </w:rPr>
+              <w:t>christophe.destrieux@univ-tours.fr</w:t>
+            </w:r>
+          </w:hyperlink>
+        </w:p>
+        <w:p>
+          <w:pPr>
+            <w:pStyle w:val="ADRESSEpieddepage"/>
+            <w:rPr>
+              <w:rFonts w:ascii="Arial" w:hAnsi="Arial" w:cs="Arial"/>
+            </w:rPr>
+          </w:pPr>
+          <w:hyperlink r:id="rId2">
+            <w:r>
+              <w:rPr>
+                <w:rStyle w:val="Lienhypertexte"/>
+                <w:rFonts w:ascii="Arial" w:hAnsi="Arial" w:cs="Arial"/>
+              </w:rPr>
+              <w:t>carine.beausse@univ-tours.fr</w:t>
+            </w:r>
+          </w:hyperlink>
+        </w:p>
+      </w:tc>
+      <w:tc>
+        <w:tcPr>
+          <w:tcW w:w="1976" w:type="dxa"/>
+          <w:tcBorders>
+            <w:top w:val="single" w:sz="4" w:space="0" w:color="FFFFFF"/>
+            <w:left w:val="single" w:sz="4" w:space="0" w:color="FFFFFF"/>
+            <w:bottom w:val="single" w:sz="4" w:space="0" w:color="FFFFFF"/>
+            <w:right w:val="single" w:sz="4" w:space="0" w:color="FFFFFF"/>
+          </w:tcBorders>
+        </w:tcPr>
+        <w:p>
+          <w:pPr>
+            <w:pStyle w:val="ADRESSEpieddepage"/>
+            <w:rPr>
+              <w:rFonts w:ascii="Arial" w:hAnsi="Arial" w:cs="Arial"/>
+            </w:rPr>
+          </w:pPr>
+          <w:hyperlink r:id="rId3">
+            <w:r>
+              <w:rPr>
+                <w:rStyle w:val="Lienhypertexte"/>
+                <w:rFonts w:ascii="Arial" w:hAnsi="Arial" w:cs="Arial"/>
+              </w:rPr>
+              <w:t>dons-corps.univ-tours.fr</w:t>
+            </w:r>
+          </w:hyperlink>
+        </w:p>
+        <w:p>
+          <w:pPr>
+            <w:pStyle w:val="ADRESSEpieddepage"/>
+            <w:rPr>
+              <w:rFonts w:ascii="Arial" w:hAnsi="Arial" w:cs="Arial"/>
+            </w:rPr>
+          </w:pPr>
+        </w:p>
+      </w:tc>
+    </w:tr>
+  </w:tbl>
   <w:p>
     <w:pPr>
       <w:pStyle w:val="ADRESSEpieddepage"/>
@@ -2135,7 +2533,58 @@
 
 <file path=word/header2.xml><?xml version="1.0" encoding="utf-8"?>
 <w:hdr xmlns:wpc="http://schemas.microsoft.com/office/word/2010/wordprocessingCanvas" xmlns:cx="http://schemas.microsoft.com/office/drawing/2014/chartex" xmlns:cx1="http://schemas.microsoft.com/office/drawing/2015/9/8/chartex" xmlns:cx2="http://schemas.microsoft.com/office/drawing/2015/10/21/chartex" xmlns:cx3="http://schemas.microsoft.com/office/drawing/2016/5/9/chartex" xmlns:cx4="http://schemas.microsoft.com/office/drawing/2016/5/10/chartex" xmlns:cx5="http://schemas.microsoft.com/office/drawing/2016/5/11/chartex" xmlns:cx6="http://schemas.microsoft.com/office/drawing/2016/5/12/chartex" xmlns:cx7="http://schemas.microsoft.com/office/drawing/2016/5/13/chartex" xmlns:cx8="http://schemas.microsoft.com/office/drawing/2016/5/14/chartex" xmlns:mc="http://schemas.openxmlformats.org/markup-compatibility/2006" xmlns:aink="http://schemas.microsoft.com/office/drawing/2016/ink" xmlns:am3d="http://schemas.microsoft.com/office/drawing/2017/model3d" xmlns:o="urn:schemas-microsoft-com:office:office" xmlns:oel="http://schemas.microsoft.com/office/2019/extlst" xmlns:r="http://schemas.openxmlformats.org/officeDocument/2006/relationships" xmlns:m="http://schemas.openxmlformats.org/officeDocument/2006/math" xmlns:v="urn:schemas-microsoft-com:vml" xmlns:wp14="http://schemas.microsoft.com/office/word/2010/wordprocessingDrawing" xmlns:wp="http://schemas.openxmlformats.org/drawingml/2006/wordprocessingDrawing" xmlns:w10="urn:schemas-microsoft-com:office:word" xmlns:w="http://schemas.openxmlformats.org/wordprocessingml/2006/main" xmlns:w14="http://schemas.microsoft.com/office/word/2010/wordml" xmlns:w15="http://schemas.microsoft.com/office/word/2012/wordml" xmlns:w16cex="http://schemas.microsoft.com/office/word/2018/wordml/cex" xmlns:w16cid="http://schemas.microsoft.com/office/word/2016/wordml/cid" xmlns:w16="http://schemas.microsoft.com/office/word/2018/wordml" xmlns:w16du="http://schemas.microsoft.com/office/word/2023/wordml/word16du" xmlns:w16sdtdh="http://schemas.microsoft.com/office/word/2020/wordml/sdtdatahash" xmlns:w16sdtfl="http://schemas.microsoft.com/office/word/2024/wordml/sdtformatlock" xmlns:w16se="http://schemas.microsoft.com/office/word/2015/wordml/symex" xmlns:wpg="http://schemas.microsoft.com/office/word/2010/wordprocessingGroup" xmlns:wpi="http://schemas.microsoft.com/office/word/2010/wordprocessingInk" xmlns:wne="http://schemas.microsoft.com/office/word/2006/wordml" xmlns:wps="http://schemas.microsoft.com/office/word/2010/wordprocessingShape" mc:Ignorable="w14 w15 w16se w16cid w16 w16cex w16sdtdh w16sdtfl w16du wp14">
-  <w:p/>
+  <w:p>
+    <w:r>
+      <w:rPr>
+        <w:noProof/>
+      </w:rPr>
+      <w:drawing>
+        <wp:anchor distT="0" distB="0" distL="0" distR="0" simplePos="0" relativeHeight="251658240" behindDoc="1" locked="0" layoutInCell="1" allowOverlap="1" wp14:anchorId="7F2551C4" wp14:editId="55BEC92F">
+          <wp:simplePos x="0" y="0"/>
+          <wp:positionH relativeFrom="column">
+            <wp:posOffset>-418465</wp:posOffset>
+          </wp:positionH>
+          <wp:positionV relativeFrom="paragraph">
+            <wp:posOffset>-418465</wp:posOffset>
+          </wp:positionV>
+          <wp:extent cx="7571105" cy="10713720"/>
+          <wp:effectExtent l="0" t="0" r="0" b="0"/>
+          <wp:wrapNone/>
+          <wp:docPr id="1" name="Image 4"/>
+          <wp:cNvGraphicFramePr>
+            <a:graphicFrameLocks xmlns:a="http://schemas.openxmlformats.org/drawingml/2006/main" noChangeAspect="1"/>
+          </wp:cNvGraphicFramePr>
+          <a:graphic xmlns:a="http://schemas.openxmlformats.org/drawingml/2006/main">
+            <a:graphicData uri="http://schemas.openxmlformats.org/drawingml/2006/picture">
+              <pic:pic xmlns:pic="http://schemas.openxmlformats.org/drawingml/2006/picture">
+                <pic:nvPicPr>
+                  <pic:cNvPr id="1" name="Image 4"/>
+                  <pic:cNvPicPr>
+                    <a:picLocks noChangeAspect="1" noChangeArrowheads="1"/>
+                  </pic:cNvPicPr>
+                </pic:nvPicPr>
+                <pic:blipFill>
+                  <a:blip r:embed="rId1"/>
+                  <a:stretch>
+                    <a:fillRect/>
+                  </a:stretch>
+                </pic:blipFill>
+                <pic:spPr bwMode="auto">
+                  <a:xfrm>
+                    <a:off x="0" y="0"/>
+                    <a:ext cx="7571105" cy="10713720"/>
+                  </a:xfrm>
+                  <a:prstGeom prst="rect">
+                    <a:avLst/>
+                  </a:prstGeom>
+                </pic:spPr>
+              </pic:pic>
+            </a:graphicData>
+          </a:graphic>
+        </wp:anchor>
+      </w:drawing>
+    </w:r>
+  </w:p>
 </w:hdr>
 </file>
 
@@ -2145,11 +2594,56 @@
     <w:pPr>
       <w:pStyle w:val="En-tte"/>
     </w:pPr>
-  </w:p>
-  <w:p>
-    <w:pPr>
-      <w:pStyle w:val="En-tte"/>
-    </w:pPr>
+    <w:r>
+      <w:rPr>
+        <w:noProof/>
+      </w:rPr>
+      <w:drawing>
+        <wp:anchor distT="0" distB="0" distL="0" distR="0" simplePos="0" relativeHeight="2" behindDoc="1" locked="0" layoutInCell="1" allowOverlap="1" wp14:anchorId="1338E904" wp14:editId="0950093C">
+          <wp:simplePos x="0" y="0"/>
+          <wp:positionH relativeFrom="column">
+            <wp:posOffset>-417830</wp:posOffset>
+          </wp:positionH>
+          <wp:positionV relativeFrom="paragraph">
+            <wp:posOffset>-417830</wp:posOffset>
+          </wp:positionV>
+          <wp:extent cx="7571105" cy="10713720"/>
+          <wp:effectExtent l="0" t="0" r="0" b="0"/>
+          <wp:wrapNone/>
+          <wp:docPr id="2" name="Image 1"/>
+          <wp:cNvGraphicFramePr>
+            <a:graphicFrameLocks xmlns:a="http://schemas.openxmlformats.org/drawingml/2006/main" noChangeAspect="1"/>
+          </wp:cNvGraphicFramePr>
+          <a:graphic xmlns:a="http://schemas.openxmlformats.org/drawingml/2006/main">
+            <a:graphicData uri="http://schemas.openxmlformats.org/drawingml/2006/picture">
+              <pic:pic xmlns:pic="http://schemas.openxmlformats.org/drawingml/2006/picture">
+                <pic:nvPicPr>
+                  <pic:cNvPr id="2" name="Image 1"/>
+                  <pic:cNvPicPr>
+                    <a:picLocks noChangeAspect="1" noChangeArrowheads="1"/>
+                  </pic:cNvPicPr>
+                </pic:nvPicPr>
+                <pic:blipFill>
+                  <a:blip r:embed="rId1"/>
+                  <a:stretch>
+                    <a:fillRect/>
+                  </a:stretch>
+                </pic:blipFill>
+                <pic:spPr bwMode="auto">
+                  <a:xfrm>
+                    <a:off x="0" y="0"/>
+                    <a:ext cx="7571105" cy="10713720"/>
+                  </a:xfrm>
+                  <a:prstGeom prst="rect">
+                    <a:avLst/>
+                  </a:prstGeom>
+                </pic:spPr>
+              </pic:pic>
+            </a:graphicData>
+          </a:graphic>
+        </wp:anchor>
+      </w:drawing>
+    </w:r>
   </w:p>
 </w:hdr>
 </file>

</xml_diff>